<commit_message>
Remove Demo Plan section from the proposal doc
Drops the "Demo Plan" heading and its 11-step walkthrough entirely;
rest of the document is unchanged.

Co-Authored-By: Claude Sonnet 5 <noreply@anthropic.com>
</commit_message>
<xml_diff>
--- a/Commas_AI_Evidence_Copilot_Product_Proposal.docx
+++ b/Commas_AI_Evidence_Copilot_Product_Proposal.docx
@@ -2949,107 +2949,6 @@
         <w:pStyle w:val="Heading1"/>
       </w:pPr>
       <w:r>
-        <w:t>Demo Plan</w:t>
-      </w:r>
-    </w:p>
-    <w:p>
-      <w:r>
-        <w:t>The prototype should be designed to communicate the product idea in under five minutes. The goal is not to prove production readiness; the goal is to demonstrate that the workflow is desirable, understandable, and technically plausible.</w:t>
-      </w:r>
-    </w:p>
-    <w:p>
-      <w:pPr>
-        <w:pStyle w:val="ListNumber"/>
-      </w:pPr>
-      <w:r>
-        <w:t>Open a realistic Resolution Center dispute.</w:t>
-      </w:r>
-    </w:p>
-    <w:p>
-      <w:pPr>
-        <w:pStyle w:val="ListNumber"/>
-      </w:pPr>
-      <w:r>
-        <w:t>Show the existing manual evidence burden briefly.</w:t>
-      </w:r>
-    </w:p>
-    <w:p>
-      <w:pPr>
-        <w:pStyle w:val="ListNumber"/>
-      </w:pPr>
-      <w:r>
-        <w:t>Click "Collect evidence with AI."</w:t>
-      </w:r>
-    </w:p>
-    <w:p>
-      <w:pPr>
-        <w:pStyle w:val="ListNumber"/>
-      </w:pPr>
-      <w:r>
-        <w:t>Show the investigation progress as evidence is collected.</w:t>
-      </w:r>
-    </w:p>
-    <w:p>
-      <w:pPr>
-        <w:pStyle w:val="ListNumber"/>
-      </w:pPr>
-      <w:r>
-        <w:t>Show the reconstructed customer journey.</w:t>
-      </w:r>
-    </w:p>
-    <w:p>
-      <w:pPr>
-        <w:pStyle w:val="ListNumber"/>
-      </w:pPr>
-      <w:r>
-        <w:t>Show the AI-generated recommended response.</w:t>
-      </w:r>
-    </w:p>
-    <w:p>
-      <w:pPr>
-        <w:pStyle w:val="ListNumber"/>
-      </w:pPr>
-      <w:r>
-        <w:t>Expand several evidence items and show "Why it matters."</w:t>
-      </w:r>
-    </w:p>
-    <w:p>
-      <w:pPr>
-        <w:pStyle w:val="ListNumber"/>
-      </w:pPr>
-      <w:r>
-        <w:t>Show AI-found vs. human-verified states.</w:t>
-      </w:r>
-    </w:p>
-    <w:p>
-      <w:pPr>
-        <w:pStyle w:val="ListNumber"/>
-      </w:pPr>
-      <w:r>
-        <w:t>Verify the evidence.</w:t>
-      </w:r>
-    </w:p>
-    <w:p>
-      <w:pPr>
-        <w:pStyle w:val="ListNumber"/>
-      </w:pPr>
-      <w:r>
-        <w:t>Show the final "Submit Response" action.</w:t>
-      </w:r>
-    </w:p>
-    <w:p>
-      <w:pPr>
-        <w:pStyle w:val="ListNumber"/>
-      </w:pPr>
-      <w:r>
-        <w:t>Close by explaining how the same architecture could learn from dispute outcomes over time.</w:t>
-      </w:r>
-    </w:p>
-    <w:p>
-      <w:pPr>
-        <w:pStyle w:val="Heading1"/>
-      </w:pPr>
-      <w:r>
         <w:t>Product Principles</w:t>
       </w:r>
     </w:p>

</xml_diff>